<commit_message>
Update CLAUDE.md and Style Guide for current project state
CLAUDE.md:
- Live URL: eest.foundation (custom domain)
- All pages marked as Fertig
- Updated IBAN (DE74 8204 0000 0102 1971 00 / COBADEFFXXX)
- Fonts: self-hosted, no Google Fonts
- No Formsubmit, no cookies, no Google Maps
- Spendenseite layout and features documented
- Footer two-row structure documented
- Mobile reorder documented
- Naming conventions: Schrägstrich, Paragrafenzeichen
- Reduced open items

Style Guide:
- Replaced "Google Fonts" with "selbst gehostet" throughout

Co-Authored-By: Claude Opus 4.6 (1M context) <noreply@anthropic.com>
</commit_message>
<xml_diff>
--- a/docs/EEST-Foundation-Styleguide.docx
+++ b/docs/EEST-Foundation-Styleguide.docx
@@ -692,7 +692,7 @@
           <w:color w:val="999999"/>
           <w:sz w:val="18"/>
         </w:rPr>
-        <w:t xml:space="preserve">  —  Headings (Google Fonts)</w:t>
+        <w:t xml:space="preserve">  —  Headings (selbst gehostete Schriftarten)</w:t>
       </w:r>
     </w:p>
     <w:p>
@@ -720,7 +720,7 @@
           <w:color w:val="999999"/>
           <w:sz w:val="18"/>
         </w:rPr>
-        <w:t xml:space="preserve">  —  Body Text (Google Fonts)</w:t>
+        <w:t xml:space="preserve">  —  Body Text (selbst gehostete Schriftarten)</w:t>
       </w:r>
     </w:p>
     <w:p>
@@ -748,7 +748,7 @@
           <w:color w:val="999999"/>
           <w:sz w:val="18"/>
         </w:rPr>
-        <w:t xml:space="preserve">  —  Navigation &amp; Buttons (Google Fonts)</w:t>
+        <w:t xml:space="preserve">  —  Navigation &amp; Buttons (selbst gehostete Schriftarten)</w:t>
       </w:r>
     </w:p>
     <w:p>

</xml_diff>